<commit_message>
Draft_039: remove blank page before FULL CODEBOOK
Double page break fixed; 111→110 pages. Overwrite in place.
</commit_message>
<xml_diff>
--- a/thesis/003_ThesisProposal_Draft_039.docx
+++ b/thesis/003_ThesisProposal_Draft_039.docx
@@ -13821,14 +13821,6 @@
         </w:tc>
       </w:tr>
     </w:tbl>
-    <w:p>
-      <w:pPr>
-        <w:spacing w:line="312" w:lineRule="auto"/>
-      </w:pPr>
-      <w:r>
-        <w:br w:type="page"/>
-      </w:r>
-    </w:p>
     <w:p>
       <w:pPr>
         <w:keepNext w:val="1"/>

</xml_diff>

<commit_message>
Draft_039: pull back Null/NS claim — elevation is Acs2
Verified: Agri Null/NS without Acs2 averages 1.0, same as non-Null. Discipline × outcome type entangled (Agri has zero Binary).
</commit_message>
<xml_diff>
--- a/thesis/003_ThesisProposal_Draft_039.docx
+++ b/thesis/003_ThesisProposal_Draft_039.docx
@@ -9420,7 +9420,7 @@
           <w:sz w:val="22"/>
           <w:rtl w:val="0"/>
         </w:rPr>
-        <w:t>Outcome type was coded for all 60 abstracts under five categories (Binary, Continuous, Mixed, Null/NS, Other). Coding used the abstract’s own results language: presence/absence or diagnostic positive/negative counts as Binary; explicit non-significance as Null/NS; means, yields, and rates as Continuous; combinations as Mixed. Table 6 shows the distribution. On that coding, the binary-outcome account of VM density is not supported. VM Binary abstracts average 0.38 hedges (n=8); Biology Binary abstracts average 1.57 (n=7). Same outcome class, substantially more hedging in Biology. The low VM rate is therefore better read as a pattern within this VM subset than as an effect of binary evidence as such. More consequential is the Null/NS concentration: Agriculture accounts for 14 of 21 Null/NS abstracts, against 2 of 20 in Veterinary Medicine. Those Agriculture Null/NS texts average about 1.5 hedges. Acs2 shows the pattern in concrete form—the writer reports that statistical significance was not observed, then hedges that the treatment could still offer potential benefits. That is hedging used to soften or rescue a non-significant result, the exact overclaiming risk the introduction identifies. One abstract cannot establish a rule, but the concentration of Null/NS outcomes in Agriculture and the explicit rescue framing in Acs2 form a clearer, more thematically central observation than the disciplinary density ranking alone. With small cells, both the VM reading and the Null/NS share remain suggestive.</w:t>
+        <w:t>Outcome type was coded for all 60 abstracts under five categories (Binary, Continuous, Mixed, Null/NS, Other). Coding used the abstract’s own results language: presence/absence or diagnostic positive/negative counts as Binary; explicit non-significance as Null/NS; means, yields, and rates as Continuous; combinations as Mixed. Table 6 shows the distribution. On that coding, the binary-outcome account of VM density is not supported. VM Binary abstracts average 0.38 hedges (n=8); Biology Binary abstracts average 1.57 (n=7). Same outcome class, substantially more hedging in Biology. The low VM rate is therefore better read as a pattern within this VM subset than as an effect of binary evidence as such. Agriculture accounts for 14 of 21 Null/NS abstracts, against 2 of 20 in Veterinary Medicine, and those Agriculture Null/NS texts average about 1.5 hedges. That elevation, however, is carried by Acs2 (8 hedges). Without Acs2 the remaining 13 Null/NS Agriculture abstracts average 1.0 hedge—the same as the non-Null Agriculture abstracts. Acs2 is still worth noting on its own terms: the writer reports that statistical significance was not observed, then hedges that the treatment could still offer potential benefits, a rescue framing that matches the introduction’s concern with overclaiming. It cannot support a Null/NS-level claim. Agriculture also has zero Binary outcomes in this sample, so discipline and study design are entangled; a formal comparison of hedge rate by outcome type across all 60 abstracts is not reported. With small cells, both the VM reading and the outcome-type patterns remain suggestive.</w:t>
       </w:r>
     </w:p>
     <w:p>
@@ -9613,7 +9613,7 @@
           <w:szCs w:val="22"/>
           <w:rtl w:val="0"/>
         </w:rPr>
-        <w:t>Limited evidence of disciplinary differentiation, mainly Veterinary Medicine’s lower density. Agriculture’s edge over Biology is modest and outlier-sensitive. More distinctive is the concentration of Null/NS outcomes in Agriculture (14 of 21) and the rescue-hedging pattern illustrated by Acs2, which links directly to the introduction’s concern with overclaiming. The data cannot separate field norms, adviser practice, and outcome type. Statistical evidence is exploratory (Kruskal-Wallis on rates p = .025) and the sample is small. The study provides a local baseline: VM abstracts in this corpus hedge less, and Agriculture shows a suggestive Null/NS–hedging link; the causes remain unknown.</w:t>
+        <w:t>Limited evidence of disciplinary differentiation, mainly Veterinary Medicine’s lower density. Agriculture’s edge over Biology is modest and outlier-sensitive. Acs2 illustrates rescue-hedging after a non-significant result, which links to the introduction’s concern with overclaiming, but it is a single abstract; the Null/NS mean in Agriculture falls to the same level as non-Null Agriculture once Acs2 is removed. The data cannot separate field norms, adviser practice, and outcome type—Agriculture has no Binary outcomes here—so discipline and study design remain entangled. Statistical evidence is exploratory (Kruskal-Wallis on rates p = .025) and the sample is small. The study provides a local baseline: VM abstracts in this corpus hedge less; the causes remain unknown.</w:t>
       </w:r>
       <w:r>
         <w:rPr>
@@ -9718,7 +9718,7 @@
           <w:szCs w:val="22"/>
           <w:rtl w:val="0"/>
         </w:rPr>
-        <w:t>Future research should examine whether the Null/NS concentration in Agriculture, the rescue-hedging pattern, and the lower Veterinary Medicine density persist across multiple institutions and groups. A multi-institutional comparison involving other Philippine state universities would help determine whether these patterns are specific to PSAU or representative of broader Philippine developing-researcher writing. Longitudinal studies tracking individual developing researchers' hedging development from first draft to final abstract would also clarify the role of adviser feedback in shaping the observed patterns.</w:t>
+        <w:t>Future research should examine whether the lower Veterinary Medicine density and patterns such as rescue-hedging after non-significant results persist across multiple institutions and groups. A multi-institutional comparison involving other Philippine state universities would help determine whether these patterns are specific to PSAU or representative of broader Philippine developing-researcher writing. Longitudinal studies tracking individual developing researchers' hedging development from first draft to final abstract would also clarify the role of adviser feedback in shaping the observed patterns.</w:t>
       </w:r>
       <w:r>
         <w:rPr>
@@ -9789,7 +9789,7 @@
           <w:szCs w:val="22"/>
           <w:rtl w:val="0"/>
         </w:rPr>
-        <w:t>Future research should examine the role of thesis advisers in shaping hedging patterns. Since undergraduate theses are heavily supervised, the observed patterns may reflect departmental standards more than individual writer choices. Interviewing advisers about their expectations for abstract writing, and specifically about their stance on hedging in scientific abstracts, would help disentangle writer agency from supervisory influence. If VM advisers explicitly discourage hedging in abstracts, or rarely require it, that would align with a supervisory-practice account of the low VM density. Parallel work could also compare how often each discipline writes up non-significant findings, given Agriculture’s high Null/NS share in this corpus and the possibility that null write-ups invite different hedging choices.</w:t>
+        <w:t>Future research should examine the role of thesis advisers in shaping hedging patterns. Since undergraduate theses are heavily supervised, the observed patterns may reflect departmental standards more than individual writer choices. Interviewing advisers about their expectations for abstract writing, and specifically about their stance on hedging in scientific abstracts, would help disentangle writer agency from supervisory influence. If VM advisers explicitly discourage hedging in abstracts, or rarely require it, that would align with a supervisory-practice account of the low VM density. Parallel work could also compare how often each discipline writes up non-significant findings and whether null write-ups invite different hedging choices, controlling for the entanglement of outcome type and discipline in this sample.</w:t>
       </w:r>
       <w:r>
         <w:rPr>

</xml_diff>

<commit_message>
Draft_039: unbold Significance body and Inclusion/Exclusion Criteria
Heading remains bold; body text no longer forced bold.
</commit_message>
<xml_diff>
--- a/thesis/003_ThesisProposal_Draft_039.docx
+++ b/thesis/003_ThesisProposal_Draft_039.docx
@@ -1296,8 +1296,8 @@
       </w:pPr>
       <w:r>
         <w:rPr>
-          <w:b w:val="1"/>
-          <w:bCs w:val="1"/>
+          <w:b w:val="0"/>
+          <w:bCs w:val="0"/>
           <w:rtl w:val="0"/>
         </w:rPr>
         <w:t>For writing instructors and thesis advisers at PSAU, the study provides an empirical baseline of how uncertainty is managed in the ratified abstracts of three applied life sciences programs. That baseline can support more targeted feedback than generic advice to “be cautious.”</w:t>
@@ -1325,8 +1325,8 @@
       </w:pPr>
       <w:r>
         <w:rPr>
-          <w:b w:val="1"/>
-          <w:bCs w:val="1"/>
+          <w:b w:val="0"/>
+          <w:bCs w:val="0"/>
           <w:rtl w:val="0"/>
         </w:rPr>
         <w:t xml:space="preserve">For academic writing researchers,</w:t>
@@ -1354,8 +1354,8 @@
       </w:pPr>
       <w:r>
         <w:rPr>
-          <w:b w:val="1"/>
-          <w:bCs w:val="1"/>
+          <w:b w:val="0"/>
+          <w:bCs w:val="0"/>
           <w:rtl w:val="0"/>
         </w:rPr>
         <w:t xml:space="preserve">For the BAELS program,</w:t>
@@ -1383,8 +1383,8 @@
       </w:pPr>
       <w:r>
         <w:rPr>
-          <w:b w:val="1"/>
-          <w:bCs w:val="1"/>
+          <w:b w:val="0"/>
+          <w:bCs w:val="0"/>
           <w:rtl w:val="0"/>
         </w:rPr>
         <w:t xml:space="preserve">For future researchers,</w:t>
@@ -4158,8 +4158,8 @@
       <w:r>
         <w:rPr>
           <w:rFonts w:ascii="Georgia" w:cs="Georgia" w:eastAsia="Georgia" w:hAnsi="Georgia"/>
-          <w:b w:val="1"/>
-          <w:bCs w:val="1"/>
+          <w:b w:val="0"/>
+          <w:bCs w:val="0"/>
           <w:i w:val="0"/>
           <w:iCs w:val="0"/>
           <w:sz w:val="22"/>
@@ -4197,8 +4197,8 @@
       <w:r>
         <w:rPr>
           <w:rFonts w:ascii="Georgia" w:cs="Georgia" w:eastAsia="Georgia" w:hAnsi="Georgia"/>
-          <w:b w:val="1"/>
-          <w:bCs w:val="1"/>
+          <w:b w:val="0"/>
+          <w:bCs w:val="0"/>
           <w:i w:val="0"/>
           <w:iCs w:val="0"/>
           <w:sz w:val="22"/>

</xml_diff>

<commit_message>
Draft_039: restore Significance bold lead-in + normal body pattern
First paragraph no longer fully bold; all four match lead-clause bold style.
</commit_message>
<xml_diff>
--- a/thesis/003_ThesisProposal_Draft_039.docx
+++ b/thesis/003_ThesisProposal_Draft_039.docx
@@ -1296,24 +1296,19 @@
       </w:pPr>
       <w:r>
         <w:rPr>
-          <w:b w:val="0"/>
-          <w:bCs w:val="0"/>
-          <w:rtl w:val="0"/>
-        </w:rPr>
-        <w:t>For writing instructors and thesis advisers at PSAU, the study provides an empirical baseline of how uncertainty is managed in the ratified abstracts of three applied life sciences programs. That baseline can support more targeted feedback than generic advice to “be cautious.”</w:t>
-      </w:r>
-      <w:r>
-        <w:rPr>
-          <w:b w:val="0"/>
-          <w:bCs w:val="0"/>
-          <w:rtl w:val="0"/>
-        </w:rPr>
-        <w:t/>
-      </w:r>
-      <w:r>
-        <w:rPr>
-          <w:rtl w:val="0"/>
-        </w:rPr>
+          <w:b w:val="1"/>
+          <w:bCs w:val="1"/>
+          <w:rtl w:val="0"/>
+        </w:rPr>
+        <w:t xml:space="preserve">For writing instructors and thesis advisers at PSAU, </w:t>
+      </w:r>
+      <w:r>
+        <w:rPr>
+          <w:b w:val="0"/>
+          <w:bCs w:val="0"/>
+          <w:rtl w:val="0"/>
+        </w:rPr>
+        <w:t xml:space="preserve">the study provides an empirical baseline of how uncertainty is managed in the ratified abstracts of three applied life sciences programs. That baseline can support more targeted feedback than generic advice to “be cautious.”</w:t>
       </w:r>
     </w:p>
     <w:p>
@@ -1325,24 +1320,19 @@
       </w:pPr>
       <w:r>
         <w:rPr>
-          <w:b w:val="0"/>
-          <w:bCs w:val="0"/>
-          <w:rtl w:val="0"/>
-        </w:rPr>
-        <w:t xml:space="preserve">For academic writing researchers,</w:t>
-      </w:r>
-      <w:r>
-        <w:rPr>
-          <w:b w:val="0"/>
-          <w:bCs w:val="0"/>
-          <w:rtl w:val="0"/>
-        </w:rPr>
-        <w:t xml:space="preserve"> it adds Philippine applied-science abstract data to a body of work that has drawn mainly from other regional and disciplinary settings.</w:t>
-      </w:r>
-      <w:r>
-        <w:rPr>
-          <w:rtl w:val="0"/>
-        </w:rPr>
+          <w:b w:val="1"/>
+          <w:bCs w:val="1"/>
+          <w:rtl w:val="0"/>
+        </w:rPr>
+        <w:t xml:space="preserve">For academic writing researchers, </w:t>
+      </w:r>
+      <w:r>
+        <w:rPr>
+          <w:b w:val="0"/>
+          <w:bCs w:val="0"/>
+          <w:rtl w:val="0"/>
+        </w:rPr>
+        <w:t xml:space="preserve">it adds Philippine applied-science abstract data to a body of work that has drawn mainly from other regional and disciplinary settings.</w:t>
       </w:r>
     </w:p>
     <w:p>
@@ -1354,24 +1344,19 @@
       </w:pPr>
       <w:r>
         <w:rPr>
-          <w:b w:val="0"/>
-          <w:bCs w:val="0"/>
-          <w:rtl w:val="0"/>
-        </w:rPr>
-        <w:t xml:space="preserve">For the BAELS program,</w:t>
-      </w:r>
-      <w:r>
-        <w:rPr>
-          <w:b w:val="0"/>
-          <w:bCs w:val="0"/>
-          <w:rtl w:val="0"/>
-        </w:rPr>
-        <w:t xml:space="preserve"> it shows that corpus-assisted discourse analysis is a viable undergraduate thesis methodology and yields findings usable in local writing pedagogy.</w:t>
-      </w:r>
-      <w:r>
-        <w:rPr>
-          <w:rtl w:val="0"/>
-        </w:rPr>
+          <w:b w:val="1"/>
+          <w:bCs w:val="1"/>
+          <w:rtl w:val="0"/>
+        </w:rPr>
+        <w:t xml:space="preserve">For the BAELS program, </w:t>
+      </w:r>
+      <w:r>
+        <w:rPr>
+          <w:b w:val="0"/>
+          <w:bCs w:val="0"/>
+          <w:rtl w:val="0"/>
+        </w:rPr>
+        <w:t xml:space="preserve">it shows that corpus-assisted discourse analysis is a viable undergraduate thesis methodology and yields findings usable in local writing pedagogy.</w:t>
       </w:r>
     </w:p>
     <w:p>
@@ -1383,24 +1368,19 @@
       </w:pPr>
       <w:r>
         <w:rPr>
-          <w:b w:val="0"/>
-          <w:bCs w:val="0"/>
-          <w:rtl w:val="0"/>
-        </w:rPr>
-        <w:t xml:space="preserve">For future researchers,</w:t>
-      </w:r>
-      <w:r>
-        <w:rPr>
-          <w:b w:val="0"/>
-          <w:bCs w:val="0"/>
-          <w:rtl w:val="0"/>
-        </w:rPr>
-        <w:t xml:space="preserve"> the sampling design, coding decision rules, and false-positive log offer a replicable protocol for similar corpus studies.</w:t>
-      </w:r>
-      <w:r>
-        <w:rPr>
-          <w:rtl w:val="0"/>
-        </w:rPr>
+          <w:b w:val="1"/>
+          <w:bCs w:val="1"/>
+          <w:rtl w:val="0"/>
+        </w:rPr>
+        <w:t xml:space="preserve">For future researchers, </w:t>
+      </w:r>
+      <w:r>
+        <w:rPr>
+          <w:b w:val="0"/>
+          <w:bCs w:val="0"/>
+          <w:rtl w:val="0"/>
+        </w:rPr>
+        <w:t xml:space="preserve">the sampling design, coding decision rules, and false-positive log offer a replicable protocol for similar corpus studies.</w:t>
       </w:r>
     </w:p>
     <w:p>
@@ -4170,19 +4150,6 @@
       </w:r>
       <w:r>
         <w:rPr>
-          <w:rFonts w:ascii="Georgia" w:cs="Georgia" w:eastAsia="Georgia" w:hAnsi="Georgia"/>
-          <w:b w:val="0"/>
-          <w:bCs w:val="0"/>
-          <w:i w:val="0"/>
-          <w:iCs w:val="0"/>
-          <w:sz w:val="22"/>
-          <w:szCs w:val="22"/>
-          <w:rtl w:val="0"/>
-        </w:rPr>
-        <w:t/>
-      </w:r>
-      <w:r>
-        <w:rPr>
           <w:rtl w:val="0"/>
         </w:rPr>
       </w:r>
@@ -4205,20 +4172,7 @@
           <w:szCs w:val="22"/>
           <w:rtl w:val="0"/>
         </w:rPr>
-        <w:t xml:space="preserve">Exclusion Criteria. </w:t>
-      </w:r>
-      <w:r>
-        <w:rPr>
-          <w:rFonts w:ascii="Georgia" w:cs="Georgia" w:eastAsia="Georgia" w:hAnsi="Georgia"/>
-          <w:b w:val="0"/>
-          <w:bCs w:val="0"/>
-          <w:i w:val="0"/>
-          <w:iCs w:val="0"/>
-          <w:sz w:val="22"/>
-          <w:szCs w:val="22"/>
-          <w:rtl w:val="0"/>
-        </w:rPr>
-        <w:t>Non-English abstracts or abstracts with significant Filipino code-switching; graduate-level theses; theses submitted under interdisciplinary degree programs (e.g., Environmental Science) where a single disciplinary affiliation cannot be determined; theses whose hard-bound submission year (library catalog) is before 2023.</w:t>
+        <w:t>Exclusion Criteria. Non-English abstracts or abstracts with significant Filipino code-switching; graduate-level theses; theses submitted under interdisciplinary degree programs (e.g., Environmental Science) where a single disciplinary affiliation cannot be determined; theses whose hard-bound submission year (library catalog) is before 2023.</w:t>
       </w:r>
       <w:r>
         <w:rPr>

</xml_diff>

<commit_message>
Draft_039: tighten Scope sampling and Part III function restatement
Research Corpus remains sole full sampling home; Appendix A intact.
</commit_message>
<xml_diff>
--- a/thesis/003_ThesisProposal_Draft_039.docx
+++ b/thesis/003_ThesisProposal_Draft_039.docx
@@ -1428,7 +1428,7 @@
           <w:szCs w:val="22"/>
           <w:rtl w:val="0"/>
         </w:rPr>
-        <w:t>This study focuses on undergraduate thesis abstracts from Agriculture, Veterinary Medicine, and Biology at PSAU. The inclusion window refers to the year of hard-bound submission as recorded in the PSAU library catalog, not the year the research was conducted. Theses conducted earlier but bound and catalogued in 2023–2025 are included; this reflects institutional practice in which submission date, particularly for irregular students, may postdate the research period by several years. The corpus consists of 60 abstracts selected through disproportionate stratified systematic sampling, with discipline as the stratification variable and fixed analytical targets per stratum to ensure equal representation regardless of population size. The distribution includes Biology (n=20), Veterinary Medicine (n=20), and Agriculture (n=20). For the Agriculture discipline, the sample is equally split between Crop Science (n=10) and Animal Science (n=10) to ensure balanced representation of the sub-disciplines. These sub-programs are analyzed as a single “Agriculture” discipline for cross-disciplinary comparison. Table 1 reports sub-program sample sizes (Crop Science n=10, Animal Science n=10), not hedge counts. No separate inferential comparison between sub-programs is undertaken.</w:t>
+        <w:t>This study focuses on undergraduate thesis abstracts from Agriculture, Veterinary Medicine, and Biology at PSAU. The inclusion window refers to the year of hard-bound submission as recorded in the PSAU library catalog, not the year the research was conducted. Theses conducted earlier but bound and catalogued in 2023–2025 are included; this reflects institutional practice in which submission date, particularly for irregular students, may postdate the research period by several years. The corpus consists of 60 abstracts (20 per discipline, with Agriculture split evenly between Crop Science and Animal Science). Sampling design, stratum intervals, and inclusion/exclusion criteria are detailed under Research Corpus; Table 1 reports population and sample sizes. Sub-programs are analyzed as a single “Agriculture” discipline for cross-disciplinary comparison; no separate inferential comparison between them is undertaken.</w:t>
       </w:r>
       <w:r>
         <w:rPr>
@@ -1454,7 +1454,7 @@
           <w:szCs w:val="22"/>
           <w:rtl w:val="0"/>
         </w:rPr>
-        <w:t>This sample size is consistent with comparable corpus-assisted discourse studies at the undergraduate level. Khunasathitchai et al. (2025) analyzed 60 abstracts. Wang (2022) examined a much larger multi-field student corpus (829 papers across 16 fields); the present study does not claim comparable scale or design. For a manually coded functional analysis within a single institution, 60 texts provide sufficient data for identifying patterns without exceeding the analytical capacity of a BA thesis. The study treats its findings as indicative patterns within the PSAU context, supplemented by exploratory inferential analyses (chi-square, Kruskal-Wallis) whose results are reported transparently but should not be treated as confirmatory given the small sample and the likelihood of zero inflation. Frequency results are reported in the Results chapter. The pilot comparison appears in Appendix B.</w:t>
+        <w:t>For a manually coded functional analysis within a single institution, 60 texts are treated as sufficient for identifying patterns within the limits of a BA thesis. Findings are indicative patterns in the PSAU context; exploratory inferential analyses (chi-square, Kruskal-Wallis) are reported transparently and should not be treated as confirmatory given the small sample and zero inflation. Comparable undergraduate corpus sizes and the larger multi-field MICUSP work are noted under Research Corpus. The pilot comparison appears in Appendix B.</w:t>
       </w:r>
       <w:r>
         <w:rPr>
@@ -7882,7 +7882,7 @@
           <w:szCs w:val="22"/>
           <w:rtl w:val="0"/>
         </w:rPr>
-        <w:t>Under the Working Test, only tokens that produced an epistemic effect were retained as hedges. As a direct consequence of that screen, all 65 retained tokens were coded Epistemic Caution (EC). No instances of Politeness/Deference (P) or Discourse Organization (DO) were identified among coded hedges. Discourse connectors such as Hence, Thus, Therefore, and In conclusion appear in the corpus and are tagged (DO) in Appendix C; they organize research moves but do not qualify claims, so they are not counted as hedges. No politeness/deference devices were found. Table 5 presents the function distribution among tokens coded as hedges.</w:t>
+        <w:t>All 65 retained hedges were coded Epistemic Caution (EC). No Politeness/Deference (P) or Discourse Organization (DO) hedges were identified. Discourse connectors such as Hence, Thus, Therefore, and In conclusion appear in the corpus and are tagged (DO) in Appendix C but are not counted as hedges. Table 5 presents the function distribution.</w:t>
       </w:r>
       <w:r>
         <w:rPr>

</xml_diff>

<commit_message>
Draft_039: normalize Part IV body fonts (Gungsuh/TNR → Georgia)
Last two Part IV paragraphs rendered differently in PDF because the
preceding body paragraph used Times New Roman and the section opener
used Gungsuh. All four paragraphs now Georgia 11 with matching
indent/spacing. PDF regenerated (110 pages).
</commit_message>
<xml_diff>
--- a/thesis/003_ThesisProposal_Draft_039.docx
+++ b/thesis/003_ThesisProposal_Draft_039.docx
@@ -8575,8 +8575,10 @@
       </w:pPr>
       <w:r>
         <w:rPr>
-          <w:rFonts w:ascii="Gungsuh" w:cs="Gungsuh" w:eastAsia="Gungsuh" w:hAnsi="Gungsuh"/>
-          <w:rtl w:val="0"/>
+          <w:rFonts w:ascii="Georgia" w:hAnsi="Georgia" w:cs="Georgia" w:eastAsia="Georgia"/>
+          <w:rtl w:val="0"/>
+          <w:sz w:val="22"/>
+          <w:szCs w:val="22"/>
         </w:rPr>
         <w:t>Parts I through III map frequency, function, and cross-disciplinary density. The contrasts below are exploratory descriptions of what was observed here, not stable discipline-level characteristics. As reported in Part II, the Kruskal-Wallis test on rates reached p = .025 and the chi-square on zero-hedge rates was p = .079. Generalization beyond this corpus is not warranted. The patterns are read through Salager-Meyer’s (1994) claim-responsibility framework and Hyland’s (2005) stance model.</w:t>
       </w:r>
@@ -9369,10 +9371,11 @@
       </w:pPr>
       <w:r>
         <w:rPr>
-          <w:rFonts w:ascii="Times New Roman" w:hAnsi="Times New Roman" w:cs="Times New Roman"/>
-          <w:b w:val="0"/>
-          <w:sz w:val="22"/>
-          <w:rtl w:val="0"/>
+          <w:rFonts w:ascii="Georgia" w:hAnsi="Georgia" w:cs="Georgia" w:eastAsia="Georgia"/>
+          <w:b w:val="0"/>
+          <w:rtl w:val="0"/>
+          <w:sz w:val="22"/>
+          <w:szCs w:val="22"/>
         </w:rPr>
         <w:t>Outcome type was coded for all 60 abstracts under five categories (Binary, Continuous, Mixed, Null/NS, Other). Coding used the abstract’s own results language: presence/absence or diagnostic positive/negative counts as Binary; explicit non-significance as Null/NS; means, yields, and rates as Continuous; combinations as Mixed. Table 6 shows the distribution. On that coding, the binary-outcome account of VM density is not supported. VM Binary abstracts average 0.38 hedges (n=8); Biology Binary abstracts average 1.57 (n=7). Same outcome class, substantially more hedging in Biology. The low VM rate is therefore better read as a pattern within this VM subset than as an effect of binary evidence as such. Agriculture accounts for 14 of 21 Null/NS abstracts, against 2 of 20 in Veterinary Medicine, and those Agriculture Null/NS texts average about 1.5 hedges. That elevation, however, is carried by Acs2 (8 hedges). Without Acs2 the remaining 13 Null/NS Agriculture abstracts average 1.0 hedge—the same as the non-Null Agriculture abstracts. Acs2 is still worth noting on its own terms: the writer reports that statistical significance was not observed, then hedges that the treatment could still offer potential benefits, a rescue framing that matches the introduction’s concern with overclaiming. It cannot support a Null/NS-level claim. Agriculture also has zero Binary outcomes in this sample, so discipline and study design are entangled; a formal comparison of hedge rate by outcome type across all 60 abstracts is not reported. With small cells, both the VM reading and the outcome-type patterns remain suggestive.</w:t>
       </w:r>
@@ -9386,20 +9389,23 @@
       </w:pPr>
       <w:r>
         <w:rPr>
-          <w:rFonts w:ascii="Georgia" w:cs="Georgia" w:eastAsia="Georgia" w:hAnsi="Georgia"/>
-          <w:b w:val="0"/>
-          <w:bCs w:val="0"/>
-          <w:i w:val="0"/>
-          <w:iCs w:val="0"/>
-          <w:sz w:val="22"/>
-          <w:szCs w:val="22"/>
-          <w:rtl w:val="0"/>
+          <w:rFonts w:ascii="Georgia" w:hAnsi="Georgia" w:cs="Georgia" w:eastAsia="Georgia"/>
+          <w:b w:val="0"/>
+          <w:bCs w:val="0"/>
+          <w:i w:val="0"/>
+          <w:iCs w:val="0"/>
+          <w:rtl w:val="0"/>
+          <w:sz w:val="22"/>
+          <w:szCs w:val="22"/>
         </w:rPr>
         <w:t xml:space="preserve">As noted in Part III, an informal reading of the tokens suggests hedges cluster in implication and conclusion sentences more than in direct results reporting. That pattern is strongest in Agriculture and weakest in Veterinary Medicine. A formal move analysis would be needed to quantify it.</w:t>
       </w:r>
       <w:r>
         <w:rPr>
-          <w:rtl w:val="0"/>
+          <w:rFonts w:ascii="Georgia" w:hAnsi="Georgia" w:cs="Georgia" w:eastAsia="Georgia"/>
+          <w:rtl w:val="0"/>
+          <w:sz w:val="22"/>
+          <w:szCs w:val="22"/>
         </w:rPr>
       </w:r>
     </w:p>
@@ -9412,20 +9418,23 @@
       </w:pPr>
       <w:r>
         <w:rPr>
-          <w:rFonts w:ascii="Georgia" w:cs="Georgia" w:eastAsia="Georgia" w:hAnsi="Georgia"/>
-          <w:b w:val="0"/>
-          <w:bCs w:val="0"/>
-          <w:i w:val="0"/>
-          <w:iCs w:val="0"/>
-          <w:sz w:val="22"/>
-          <w:szCs w:val="22"/>
-          <w:rtl w:val="0"/>
+          <w:rFonts w:ascii="Georgia" w:hAnsi="Georgia" w:cs="Georgia" w:eastAsia="Georgia"/>
+          <w:b w:val="0"/>
+          <w:bCs w:val="0"/>
+          <w:i w:val="0"/>
+          <w:iCs w:val="0"/>
+          <w:rtl w:val="0"/>
+          <w:sz w:val="22"/>
+          <w:szCs w:val="22"/>
         </w:rPr>
         <w:t>As noted in Scope, the study cannot separate genuine field norms from adviser-enforced conventions; the findings describe the ratified abstracts, not individual cognition.</w:t>
       </w:r>
       <w:r>
         <w:rPr>
-          <w:rtl w:val="0"/>
+          <w:rFonts w:ascii="Georgia" w:hAnsi="Georgia" w:cs="Georgia" w:eastAsia="Georgia"/>
+          <w:rtl w:val="0"/>
+          <w:sz w:val="22"/>
+          <w:szCs w:val="22"/>
         </w:rPr>
       </w:r>
     </w:p>

</xml_diff>

<commit_message>
Draft_039: force Georgia on all body/table runs
Full document pass — Times New Roman, Gungsuh, Caudex, and unnamed
runs set to Georgia (all four rFonts slots). PDF regenerated (110 pp).
</commit_message>
<xml_diff>
--- a/thesis/003_ThesisProposal_Draft_039.docx
+++ b/thesis/003_ThesisProposal_Draft_039.docx
@@ -1296,6 +1296,7 @@
       </w:pPr>
       <w:r>
         <w:rPr>
+          <w:rFonts w:ascii="Georgia" w:hAnsi="Georgia" w:cs="Georgia" w:eastAsia="Georgia"/>
           <w:b w:val="1"/>
           <w:bCs w:val="1"/>
           <w:rtl w:val="0"/>
@@ -1304,6 +1305,7 @@
       </w:r>
       <w:r>
         <w:rPr>
+          <w:rFonts w:ascii="Georgia" w:hAnsi="Georgia" w:cs="Georgia" w:eastAsia="Georgia"/>
           <w:b w:val="0"/>
           <w:bCs w:val="0"/>
           <w:rtl w:val="0"/>
@@ -1320,6 +1322,7 @@
       </w:pPr>
       <w:r>
         <w:rPr>
+          <w:rFonts w:ascii="Georgia" w:hAnsi="Georgia" w:cs="Georgia" w:eastAsia="Georgia"/>
           <w:b w:val="1"/>
           <w:bCs w:val="1"/>
           <w:rtl w:val="0"/>
@@ -1328,6 +1331,7 @@
       </w:r>
       <w:r>
         <w:rPr>
+          <w:rFonts w:ascii="Georgia" w:hAnsi="Georgia" w:cs="Georgia" w:eastAsia="Georgia"/>
           <w:b w:val="0"/>
           <w:bCs w:val="0"/>
           <w:rtl w:val="0"/>
@@ -1344,6 +1348,7 @@
       </w:pPr>
       <w:r>
         <w:rPr>
+          <w:rFonts w:ascii="Georgia" w:hAnsi="Georgia" w:cs="Georgia" w:eastAsia="Georgia"/>
           <w:b w:val="1"/>
           <w:bCs w:val="1"/>
           <w:rtl w:val="0"/>
@@ -1352,6 +1357,7 @@
       </w:r>
       <w:r>
         <w:rPr>
+          <w:rFonts w:ascii="Georgia" w:hAnsi="Georgia" w:cs="Georgia" w:eastAsia="Georgia"/>
           <w:b w:val="0"/>
           <w:bCs w:val="0"/>
           <w:rtl w:val="0"/>
@@ -1368,6 +1374,7 @@
       </w:pPr>
       <w:r>
         <w:rPr>
+          <w:rFonts w:ascii="Georgia" w:hAnsi="Georgia" w:cs="Georgia" w:eastAsia="Georgia"/>
           <w:b w:val="1"/>
           <w:bCs w:val="1"/>
           <w:rtl w:val="0"/>
@@ -1376,6 +1383,7 @@
       </w:r>
       <w:r>
         <w:rPr>
+          <w:rFonts w:ascii="Georgia" w:hAnsi="Georgia" w:cs="Georgia" w:eastAsia="Georgia"/>
           <w:b w:val="0"/>
           <w:bCs w:val="0"/>
           <w:rtl w:val="0"/>
@@ -1523,6 +1531,7 @@
       </w:pPr>
       <w:r>
         <w:rPr>
+          <w:rFonts w:ascii="Georgia" w:hAnsi="Georgia" w:cs="Georgia" w:eastAsia="Georgia"/>
           <w:rtl w:val="0"/>
         </w:rPr>
         <w:t xml:space="preserve">Reliability was assessed through intra-rater agreement only. A second coder was not available for inter-rater reliability testing, which limits the extent to which the coding scheme can be verified against an independent application of the same decision rules. This limitation particularly affects the functional findings reported in Part III. The uniform assignment of all 65 hedges to the Epistemic Caution function may reflect a single coder's interpretive frame rather than a property of the corpus itself. Future research with inter-rater coding on at least a subset of the corpus is needed to test the robustness of the functional findings before they can be treated as established.</w:t>
@@ -1537,6 +1546,7 @@
       </w:pPr>
       <w:r>
         <w:rPr>
+          <w:rFonts w:ascii="Georgia" w:hAnsi="Georgia" w:cs="Georgia" w:eastAsia="Georgia"/>
           <w:rtl w:val="0"/>
         </w:rPr>
         <w:t xml:space="preserve">The study also lacks a comparable expert-abstract corpus against which to compare the functional findings. The absence of interactional hedges (Politeness, Discourse Organization) in this corpus may reflect genre compression in abstracts rather than writer deficit. Expert abstracts in the same three disciplines, coded with the same scheme, would allow the study to distinguish genre effects from writer-competence effects. Future research with such a comparison corpus is needed before the functional narrowness reported here can be attributed to writer characteristics rather than to genre constraints.</w:t>
@@ -4197,14 +4207,14 @@
       </w:pPr>
       <w:r>
         <w:rPr>
-          <w:rFonts w:ascii="Times New Roman" w:cs="Times New Roman" w:eastAsia="Georgia" w:hAnsi="Times New Roman"/>
-          <w:b w:val="0"/>
-          <w:bCs w:val="1"/>
-          <w:i w:val="0"/>
-          <w:iCs w:val="0"/>
-          <w:sz w:val="22"/>
-          <w:szCs w:val="22"/>
-          <w:rtl w:val="0"/>
+          <w:rFonts w:ascii="Georgia" w:hAnsi="Georgia" w:cs="Georgia" w:eastAsia="Georgia"/>
+          <w:b w:val="0"/>
+          <w:bCs w:val="1"/>
+          <w:i w:val="0"/>
+          <w:iCs w:val="0"/>
+          <w:rtl w:val="0"/>
+          <w:sz w:val="22"/>
+          <w:szCs w:val="22"/>
         </w:rPr>
         <w:t>Ethical Considerations. Abstracts were accessed on-site at the PSAU Library with proper authorization. Student names were fully anonymized using discipline codes (Acs1–Acs10, Aas1–Aas10, VM1–VM20, B1–B20) before analysis began. Thesis titles that appear as quoted wording inside an abstract (source text) were redacted in the coded appendix where they identified the work; residual title fragments, if any, do not include student names. The study analyzed linguistic patterns in text, not student performance or personal information. All data files were stored on password-protected devices and encrypted cloud storage accessible only to the researcher and thesis adviser. These files are retained for five years to support verification of coding decisions by future researchers and to allow for follow-up comparative studies, after which they are permanently deleted in line with standard academic data retention practice.</w:t>
       </w:r>
@@ -5041,14 +5051,14 @@
       </w:pPr>
       <w:r>
         <w:rPr>
-          <w:rFonts w:ascii="Times New Roman" w:cs="Times New Roman" w:eastAsia="Georgia" w:hAnsi="Times New Roman"/>
-          <w:b w:val="0"/>
-          <w:bCs w:val="0"/>
-          <w:i w:val="0"/>
-          <w:iCs w:val="0"/>
-          <w:sz w:val="22"/>
-          <w:szCs w:val="22"/>
-          <w:rtl w:val="0"/>
+          <w:rFonts w:ascii="Georgia" w:hAnsi="Georgia" w:cs="Georgia" w:eastAsia="Georgia"/>
+          <w:b w:val="0"/>
+          <w:bCs w:val="0"/>
+          <w:i w:val="0"/>
+          <w:iCs w:val="0"/>
+          <w:rtl w:val="0"/>
+          <w:sz w:val="22"/>
+          <w:szCs w:val="22"/>
         </w:rPr>
         <w:t>The distribution of hedge types shows cross-disciplinary differences, most clearly in Veterinary Medicine’s small total and low modal share. Table 3 presents the per-discipline breakdown of hedge types.</w:t>
       </w:r>
@@ -6115,14 +6125,14 @@
       </w:pPr>
       <w:r>
         <w:rPr>
-          <w:rFonts w:ascii="Times New Roman" w:cs="Times New Roman" w:eastAsia="Georgia" w:hAnsi="Times New Roman"/>
-          <w:b w:val="0"/>
-          <w:bCs w:val="0"/>
-          <w:i w:val="0"/>
-          <w:iCs w:val="0"/>
-          <w:sz w:val="22"/>
-          <w:szCs w:val="22"/>
-          <w:rtl w:val="0"/>
+          <w:rFonts w:ascii="Georgia" w:hAnsi="Georgia" w:cs="Georgia" w:eastAsia="Georgia"/>
+          <w:b w:val="0"/>
+          <w:bCs w:val="0"/>
+          <w:i w:val="0"/>
+          <w:iCs w:val="0"/>
+          <w:rtl w:val="0"/>
+          <w:sz w:val="22"/>
+          <w:szCs w:val="22"/>
         </w:rPr>
         <w:t>Table 3 shows that Agriculture has a nearly balanced type mix (14 modal verbs, 51.9% vs. 13 lexical hedges, 48.1%), while Biology is heavily lexical (20 of 28 hedges, 71.4%, with only 5 modal verbs). Veterinary Medicine, with only 10 total hedges, is also predominantly lexical (8 of 10, 80.0%). Agriculture is the only discipline in which modal verbs approach half of the hedge tokens; Biology and Veterinary Medicine lean lexical. That contrast is real in the counts, but the Ag–Bio difference in overall density is marginal and outlier-sensitive (Part II), so type-mix differences should not be read as a stable Agriculture-versus-Biology profile. The near-absence of adverbial hedges across all three disciplines (only 3 instances, all in Biology) points instead to a shared, narrow repertoire.</w:t>
       </w:r>
@@ -6141,14 +6151,14 @@
       </w:pPr>
       <w:r>
         <w:rPr>
-          <w:rFonts w:ascii="Times New Roman" w:cs="Times New Roman" w:eastAsia="Georgia" w:hAnsi="Times New Roman"/>
-          <w:b w:val="0"/>
-          <w:bCs w:val="0"/>
-          <w:i w:val="0"/>
-          <w:iCs w:val="0"/>
-          <w:sz w:val="22"/>
-          <w:szCs w:val="22"/>
-          <w:rtl w:val="0"/>
+          <w:rFonts w:ascii="Georgia" w:hAnsi="Georgia" w:cs="Georgia" w:eastAsia="Georgia"/>
+          <w:b w:val="0"/>
+          <w:bCs w:val="0"/>
+          <w:i w:val="0"/>
+          <w:iCs w:val="0"/>
+          <w:rtl w:val="0"/>
+          <w:sz w:val="22"/>
+          <w:szCs w:val="22"/>
         </w:rPr>
         <w:t>The absence of clause-level hedges is consistent with the compressed abstract genre and with the supervised character of the corpus. Science abstracts favor impersonal, compact reporting; clause-level frames that foreground the writer’s stance (including first-person forms such as “I think” or “in our view,” and more impersonal ones such as “it seems that”) are uncommon in that register. The Scope and Limitations section notes that the texts are ratified products shaped by adviser feedback, so the zero count is better read as a feature of the genre and of departmental practice than as evidence that these writers lack the syntactic means to hedge at clause level. The same restricted range of devices has been observed in other developing-writer corpora (Hyland &amp; Milton, 1997); here the institutional and genre setting supplies the more proximate explanation.</w:t>
       </w:r>
@@ -6272,14 +6282,14 @@
       </w:pPr>
       <w:r>
         <w:rPr>
-          <w:rFonts w:ascii="Times New Roman" w:cs="Times New Roman" w:eastAsia="Georgia" w:hAnsi="Times New Roman"/>
-          <w:b w:val="0"/>
-          <w:bCs w:val="0"/>
-          <w:i w:val="0"/>
-          <w:iCs w:val="0"/>
-          <w:sz w:val="22"/>
-          <w:szCs w:val="22"/>
-          <w:rtl w:val="0"/>
+          <w:rFonts w:ascii="Georgia" w:hAnsi="Georgia" w:cs="Georgia" w:eastAsia="Georgia"/>
+          <w:b w:val="0"/>
+          <w:bCs w:val="0"/>
+          <w:i w:val="0"/>
+          <w:iCs w:val="0"/>
+          <w:rtl w:val="0"/>
+          <w:sz w:val="22"/>
+          <w:szCs w:val="22"/>
         </w:rPr>
         <w:t>Cross-disciplinary comparison shows differences in hedge density, driven mainly by Veterinary Medicine’s lower rate. Table 4 presents the hedge counts, false positives, unhedged sites, and normalized frequency (hedges per 100 words) for each discipline.</w:t>
       </w:r>
@@ -7742,14 +7752,14 @@
       </w:pPr>
       <w:r>
         <w:rPr>
-          <w:rFonts w:ascii="Gungsuh" w:cs="Gungsuh" w:eastAsia="Gungsuh" w:hAnsi="Gungsuh"/>
-          <w:b w:val="0"/>
-          <w:bCs w:val="0"/>
-          <w:i w:val="0"/>
-          <w:iCs w:val="0"/>
-          <w:sz w:val="22"/>
-          <w:szCs w:val="22"/>
-          <w:rtl w:val="0"/>
+          <w:rFonts w:ascii="Georgia" w:hAnsi="Georgia" w:cs="Georgia" w:eastAsia="Georgia"/>
+          <w:b w:val="0"/>
+          <w:bCs w:val="0"/>
+          <w:i w:val="0"/>
+          <w:iCs w:val="0"/>
+          <w:rtl w:val="0"/>
+          <w:sz w:val="22"/>
+          <w:szCs w:val="22"/>
         </w:rPr>
         <w:t>Per-abstract hedge distributions reveal substantial skew. Agriculture abstracts averaged 1.35 hedges (median = 1, SD = 1.84, range = 0–8), Biology averaged 1.40 (median = 1, SD = 1.31, range = 0–5), and Veterinary Medicine averaged 0.50 (median = 0, SD = 0.76, range = 0–3). The high standard deviation in Agriculture reflects the influence of Acs2, which contained 8 hedges alone. When Acs2 is excluded as a sensitivity check, Agriculture's density drops to 0.46 per 100 words, below Biology's 0.62, suggesting that the Agriculture &gt; Biology ranking is partly driven by a single outlier abstract. An exploratory Kruskal-Wallis test on per-abstract hedge rates (per 100 words) yielded H ≈ 7.39, p = .025. Abstracts within a program may share advisers, so observations are not fully independent, and within-discipline spread remains larger than the gaps between means. With a small, zero-inflated sample and no multiple-comparison correction, the result is treated as exploratory. A sensitivity check that removes all 19 instances of "potential" leaves 46 hedges; the Kruskal-Wallis contrast remains in the same direction, and Veterinary Medicine’s zero-hedge share rises further. The directional pattern is therefore not an artifact of the "potential" tokens alone.</w:t>
       </w:r>
@@ -8479,10 +8489,11 @@
       </w:pPr>
       <w:r>
         <w:rPr>
-          <w:rFonts w:ascii="Times New Roman" w:hAnsi="Times New Roman" w:cs="Times New Roman"/>
-          <w:b w:val="0"/>
-          <w:sz w:val="22"/>
-          <w:rtl w:val="0"/>
+          <w:rFonts w:ascii="Georgia" w:hAnsi="Georgia" w:cs="Georgia" w:eastAsia="Georgia"/>
+          <w:b w:val="0"/>
+          <w:rtl w:val="0"/>
+          <w:sz w:val="22"/>
+          <w:szCs w:val="22"/>
         </w:rPr>
         <w:t>The uniform assignment may reflect a restricted repertoire, the compressed abstract genre, the coding scheme, or single-rater interpretation; that limitation is noted in Scope. The narrow functional range is consistent with the restricted set of epistemic devices reported for developing L2 writers (Hyland &amp; Milton, 1997), though in this corpus genre compression and supervisory practice remain the more proximate accounts.</w:t>
       </w:r>
@@ -9567,14 +9578,14 @@
       </w:pPr>
       <w:r>
         <w:rPr>
-          <w:rFonts w:ascii="Gungsuh" w:cs="Gungsuh" w:eastAsia="Gungsuh" w:hAnsi="Gungsuh"/>
-          <w:b w:val="0"/>
-          <w:bCs w:val="0"/>
-          <w:i w:val="0"/>
-          <w:iCs w:val="0"/>
-          <w:sz w:val="22"/>
-          <w:szCs w:val="22"/>
-          <w:rtl w:val="0"/>
+          <w:rFonts w:ascii="Georgia" w:hAnsi="Georgia" w:cs="Georgia" w:eastAsia="Georgia"/>
+          <w:b w:val="0"/>
+          <w:bCs w:val="0"/>
+          <w:i w:val="0"/>
+          <w:iCs w:val="0"/>
+          <w:rtl w:val="0"/>
+          <w:sz w:val="22"/>
+          <w:szCs w:val="22"/>
         </w:rPr>
         <w:t>Limited evidence of disciplinary differentiation, mainly Veterinary Medicine’s lower density. Agriculture’s edge over Biology is modest and outlier-sensitive. Acs2 illustrates rescue-hedging after a non-significant result, which links to the introduction’s concern with overclaiming, but it is a single abstract; the Null/NS mean in Agriculture falls to the same level as non-Null Agriculture once Acs2 is removed. The data cannot separate field norms, adviser practice, and outcome type—Agriculture has no Binary outcomes here—so discipline and study design remain entangled. Statistical evidence is exploratory (Kruskal-Wallis on rates p = .025) and the sample is small. The study provides a local baseline: VM abstracts in this corpus hedge less; the causes remain unknown.</w:t>
       </w:r>
@@ -10831,7 +10842,9 @@
         <w:rPr/>
       </w:pPr>
       <w:r>
-        <w:rPr/>
+        <w:rPr>
+          <w:rFonts w:ascii="Georgia" w:hAnsi="Georgia" w:cs="Georgia" w:eastAsia="Georgia"/>
+        </w:rPr>
         <w:t xml:space="preserve">This appendix is the full coding protocol used for the study. It opens with a one-page quick-reference, then a one-page legend and coding-sheet section, then the operational layers, decision rules, false-positive categories, and recording conventions.</w:t>
       </w:r>
     </w:p>
@@ -11134,12 +11147,12 @@
       </w:pPr>
       <w:r>
         <w:rPr>
-          <w:rFonts w:ascii="Georgia" w:cs="Cardo" w:eastAsia="Cardo" w:hAnsi="Georgia"/>
+          <w:rFonts w:ascii="Georgia" w:hAnsi="Georgia" w:cs="Georgia" w:eastAsia="Georgia"/>
+          <w:rtl w:val="0"/>
+          <w:i/>
+          <w:iCs/>
           <w:sz w:val="24"/>
           <w:szCs w:val="24"/>
-          <w:rtl w:val="0"/>
-          <w:i/>
-          <w:iCs/>
         </w:rPr>
         <w:t xml:space="preserve">suggest / indicate → hedge when introducing a finding; not a hedge when introducing a recommendation.</w:t>
       </w:r>
@@ -11163,12 +11176,12 @@
       </w:pPr>
       <w:r>
         <w:rPr>
-          <w:rFonts w:ascii="Georgia" w:cs="Cardo" w:eastAsia="Cardo" w:hAnsi="Georgia"/>
+          <w:rFonts w:ascii="Georgia" w:hAnsi="Georgia" w:cs="Georgia" w:eastAsia="Georgia"/>
+          <w:rtl w:val="0"/>
+          <w:i/>
+          <w:iCs/>
           <w:sz w:val="24"/>
           <w:szCs w:val="24"/>
-          <w:rtl w:val="0"/>
-          <w:i/>
-          <w:iCs/>
         </w:rPr>
         <w:t xml:space="preserve">can / may → hedge when marking possibility; not a hedge when marking capability.</w:t>
       </w:r>
@@ -11192,12 +11205,12 @@
       </w:pPr>
       <w:r>
         <w:rPr>
-          <w:rFonts w:ascii="Georgia" w:cs="Cardo" w:eastAsia="Cardo" w:hAnsi="Georgia"/>
+          <w:rFonts w:ascii="Georgia" w:hAnsi="Georgia" w:cs="Georgia" w:eastAsia="Georgia"/>
+          <w:rtl w:val="0"/>
+          <w:i/>
+          <w:iCs/>
           <w:sz w:val="24"/>
           <w:szCs w:val="24"/>
-          <w:rtl w:val="0"/>
-          <w:i/>
-          <w:iCs/>
         </w:rPr>
         <w:t xml:space="preserve">generally / typically → hedge when limiting the scope of a claim; not a hedge when describing a procedural norm.</w:t>
       </w:r>
@@ -11221,12 +11234,12 @@
       </w:pPr>
       <w:r>
         <w:rPr>
-          <w:rFonts w:ascii="Georgia" w:cs="Cardo" w:eastAsia="Cardo" w:hAnsi="Georgia"/>
+          <w:rFonts w:ascii="Georgia" w:hAnsi="Georgia" w:cs="Georgia" w:eastAsia="Georgia"/>
+          <w:rtl w:val="0"/>
+          <w:i/>
+          <w:iCs/>
           <w:sz w:val="24"/>
           <w:szCs w:val="24"/>
-          <w:rtl w:val="0"/>
-          <w:i/>
-          <w:iCs/>
         </w:rPr>
         <w:t xml:space="preserve">appear / seem → hedge when expressing uncertainty about a result; not a hedge when pointing to location in a table or text.</w:t>
       </w:r>
@@ -11990,12 +12003,14 @@
       </w:r>
       <w:r>
         <w:rPr>
+          <w:rFonts w:ascii="Georgia" w:hAnsi="Georgia" w:cs="Georgia" w:eastAsia="Georgia"/>
           <w:color w:val="000000"/>
         </w:rPr>
         <w:t xml:space="preserve"> that C. longa extracts are </w:t>
       </w:r>
       <w:r>
         <w:rPr>
+          <w:rFonts w:ascii="Georgia" w:hAnsi="Georgia" w:cs="Georgia" w:eastAsia="Georgia"/>
           <w:highlight w:val="red"/>
           <w:color w:val="ffffff"/>
         </w:rPr>
@@ -12003,18 +12018,21 @@
       </w:r>
       <w:r>
         <w:rPr>
+          <w:rFonts w:ascii="Georgia" w:hAnsi="Georgia" w:cs="Georgia" w:eastAsia="Georgia"/>
           <w:color w:val="000000"/>
         </w:rPr>
         <w:t xml:space="preserve"> </w:t>
       </w:r>
       <w:r>
         <w:rPr>
+          <w:rFonts w:ascii="Georgia" w:hAnsi="Georgia" w:cs="Georgia" w:eastAsia="Georgia"/>
           <w:color w:val="ed7d31"/>
         </w:rPr>
         <w:t>(EC)</w:t>
       </w:r>
       <w:r>
         <w:rPr>
+          <w:rFonts w:ascii="Georgia" w:hAnsi="Georgia" w:cs="Georgia" w:eastAsia="Georgia"/>
           <w:color w:val="000000"/>
         </w:rPr>
         <w:t xml:space="preserve"> alternative stains. PCR </w:t>
@@ -18536,11 +18554,12 @@
       </w:pPr>
       <w:r>
         <w:rPr>
+          <w:rFonts w:ascii="Georgia" w:hAnsi="Georgia" w:cs="Georgia" w:eastAsia="Georgia"/>
           <w:i w:val="1"/>
           <w:iCs w:val="1"/>
+          <w:rtl w:val="0"/>
           <w:sz w:val="24"/>
           <w:szCs w:val="24"/>
-          <w:rtl w:val="0"/>
         </w:rPr>
         <w:t xml:space="preserve">Sample 1: Biology</w:t>
       </w:r>
@@ -19495,15 +19514,15 @@
       </w:r>
       <w:r>
         <w:rPr>
-          <w:rFonts w:ascii="Caudex" w:cs="Caudex" w:eastAsia="Caudex" w:hAnsi="Caudex"/>
-          <w:b w:val="0"/>
-          <w:bCs w:val="0"/>
-          <w:i w:val="0"/>
-          <w:iCs w:val="0"/>
-          <w:color w:val="000000"/>
-          <w:sz w:val="22"/>
-          <w:szCs w:val="22"/>
-          <w:rtl w:val="0"/>
+          <w:rFonts w:ascii="Georgia" w:hAnsi="Georgia" w:cs="Georgia" w:eastAsia="Georgia"/>
+          <w:b w:val="0"/>
+          <w:bCs w:val="0"/>
+          <w:i w:val="0"/>
+          <w:iCs w:val="0"/>
+          <w:color w:val="000000"/>
+          <w:rtl w:val="0"/>
+          <w:sz w:val="22"/>
+          <w:szCs w:val="22"/>
         </w:rPr>
         <w:t xml:space="preserve"> that Bacillus subtilis formulation (9.0 x 10⁸ CFU/mL) of 10 g/L (T1), 30 g/L (T2), and 50 g/L (T3) concentrations exhibited a notable increase in plant growth parameters. Based on statistical analysis using the Kruskal-Wallis test, Welch One-way Analysis of Variance, and One-way ANOVA, the three varying concentrations of B. subtilis formulations have no significant differences in their effects on the plant growth parameters including plant height, number of leaves, length of leaves, and width of leaves of onion plants (p-value ≥ 0.05). They also presented no significant difference in their effects with the positive control, Nitrogen-Phosphorus-Potassium (NPK 20:20:20) (p-value ≥ 0.05). This </w:t>
       </w:r>
@@ -19537,15 +19556,15 @@
       </w:r>
       <w:r>
         <w:rPr>
-          <w:rFonts w:ascii="Gungsuh" w:cs="Gungsuh" w:eastAsia="Gungsuh" w:hAnsi="Gungsuh"/>
-          <w:b w:val="0"/>
-          <w:bCs w:val="0"/>
-          <w:i w:val="0"/>
-          <w:iCs w:val="0"/>
-          <w:color w:val="000000"/>
-          <w:sz w:val="22"/>
-          <w:szCs w:val="22"/>
-          <w:rtl w:val="0"/>
+          <w:rFonts w:ascii="Georgia" w:hAnsi="Georgia" w:cs="Georgia" w:eastAsia="Georgia"/>
+          <w:b w:val="0"/>
+          <w:bCs w:val="0"/>
+          <w:i w:val="0"/>
+          <w:iCs w:val="0"/>
+          <w:color w:val="000000"/>
+          <w:rtl w:val="0"/>
+          <w:sz w:val="22"/>
+          <w:szCs w:val="22"/>
         </w:rPr>
         <w:t xml:space="preserve"> that the use of low concentration of B. subtilis BIOTECH 1679 are as effective in promoting the growth of onion. Welch ANOVA revealed that different treatments showed significantly larger leaf width (p-value ≤ 0.05). However, One-way ANOVA revealed that B. subtilis BIOTECH 1679, regardless of the concentration used, demonstrated shorter root length as compared with that of NPK (20:20:20) (p-value ≤ 0.05). The results provided valuable insights into the </w:t>
       </w:r>
@@ -20783,6 +20802,7 @@
       </w:r>
       <w:r>
         <w:rPr>
+          <w:rFonts w:ascii="Georgia" w:hAnsi="Georgia" w:cs="Georgia" w:eastAsia="Georgia"/>
           <w:color w:val="00B0F0"/>
         </w:rPr>
         <w:t>(DO)</w:t>
@@ -22542,6 +22562,7 @@
       </w:r>
       <w:r>
         <w:rPr>
+          <w:rFonts w:ascii="Georgia" w:hAnsi="Georgia" w:cs="Georgia" w:eastAsia="Georgia"/>
           <w:color w:val="00B0F0"/>
         </w:rPr>
         <w:t>(DO)</w:t>
@@ -30748,7 +30769,7 @@
       <w:spacing w:after="0" w:before="480" w:lineRule="auto"/>
     </w:pPr>
     <w:rPr>
-      <w:rFonts w:ascii="Calibri" w:cs="Calibri" w:eastAsia="Calibri" w:hAnsi="Calibri"/>
+      <w:rFonts w:ascii="Georgia" w:hAnsi="Georgia" w:cs="Georgia" w:eastAsia="Georgia"/>
       <w:b w:val="1"/>
       <w:bCs w:val="1"/>
       <w:color w:val="366091"/>
@@ -30766,7 +30787,7 @@
       <w:spacing w:after="0" w:before="200" w:lineRule="auto"/>
     </w:pPr>
     <w:rPr>
-      <w:rFonts w:ascii="Calibri" w:cs="Calibri" w:eastAsia="Calibri" w:hAnsi="Calibri"/>
+      <w:rFonts w:ascii="Georgia" w:hAnsi="Georgia" w:cs="Georgia" w:eastAsia="Georgia"/>
       <w:b w:val="1"/>
       <w:bCs w:val="1"/>
       <w:color w:val="4f81bd"/>
@@ -30784,7 +30805,7 @@
       <w:spacing w:after="0" w:before="200" w:lineRule="auto"/>
     </w:pPr>
     <w:rPr>
-      <w:rFonts w:ascii="Calibri" w:cs="Calibri" w:eastAsia="Calibri" w:hAnsi="Calibri"/>
+      <w:rFonts w:ascii="Georgia" w:hAnsi="Georgia" w:cs="Georgia" w:eastAsia="Georgia"/>
       <w:b w:val="1"/>
       <w:bCs w:val="1"/>
       <w:color w:val="4f81bd"/>
@@ -30800,7 +30821,7 @@
       <w:spacing w:after="0" w:before="200" w:lineRule="auto"/>
     </w:pPr>
     <w:rPr>
-      <w:rFonts w:ascii="Calibri" w:cs="Calibri" w:eastAsia="Calibri" w:hAnsi="Calibri"/>
+      <w:rFonts w:ascii="Georgia" w:hAnsi="Georgia" w:cs="Georgia" w:eastAsia="Georgia"/>
       <w:b w:val="1"/>
       <w:bCs w:val="1"/>
       <w:i w:val="1"/>
@@ -30818,7 +30839,7 @@
       <w:spacing w:after="0" w:before="200" w:lineRule="auto"/>
     </w:pPr>
     <w:rPr>
-      <w:rFonts w:ascii="Calibri" w:cs="Calibri" w:eastAsia="Calibri" w:hAnsi="Calibri"/>
+      <w:rFonts w:ascii="Georgia" w:hAnsi="Georgia" w:cs="Georgia" w:eastAsia="Georgia"/>
       <w:color w:val="243f61"/>
     </w:rPr>
   </w:style>
@@ -30832,7 +30853,7 @@
       <w:spacing w:after="0" w:before="200" w:lineRule="auto"/>
     </w:pPr>
     <w:rPr>
-      <w:rFonts w:ascii="Calibri" w:cs="Calibri" w:eastAsia="Calibri" w:hAnsi="Calibri"/>
+      <w:rFonts w:ascii="Georgia" w:hAnsi="Georgia" w:cs="Georgia" w:eastAsia="Georgia"/>
       <w:i w:val="1"/>
       <w:iCs w:val="1"/>
       <w:color w:val="243f61"/>
@@ -30849,7 +30870,7 @@
       <w:spacing w:after="300" w:line="240" w:lineRule="auto"/>
     </w:pPr>
     <w:rPr>
-      <w:rFonts w:ascii="Calibri" w:cs="Calibri" w:eastAsia="Calibri" w:hAnsi="Calibri"/>
+      <w:rFonts w:ascii="Georgia" w:hAnsi="Georgia" w:cs="Georgia" w:eastAsia="Georgia"/>
       <w:color w:val="17365d"/>
       <w:sz w:val="52"/>
       <w:szCs w:val="52"/>
@@ -30861,7 +30882,7 @@
     <w:next w:val="Normal"/>
     <w:pPr/>
     <w:rPr>
-      <w:rFonts w:ascii="Calibri" w:cs="Calibri" w:eastAsia="Calibri" w:hAnsi="Calibri"/>
+      <w:rFonts w:ascii="Georgia" w:hAnsi="Georgia" w:cs="Georgia" w:eastAsia="Georgia"/>
       <w:i w:val="1"/>
       <w:iCs w:val="1"/>
       <w:color w:val="4f81bd"/>

</xml_diff>